<commit_message>
docs: atualizar documento de visão geral da arquitetura do sistema
</commit_message>
<xml_diff>
--- a/docs/architecture/Visao_geral_sistema_tech_challenge.docx
+++ b/docs/architecture/Visao_geral_sistema_tech_challenge.docx
@@ -55,48 +55,21 @@
       <w:pPr>
         <w:ind w:firstLine="0"/>
         <w:jc w:val="center"/>
-        <w:rPr>
-          <w:lang w:val="en-US"/>
-        </w:rPr>
-      </w:pPr>
+      </w:pPr>
+      <w:r>
+        <w:t>Pós Tech</w:t>
+      </w:r>
+      <w:r>
+        <w:t xml:space="preserve"> de </w:t>
+      </w:r>
+      <w:r>
+        <w:t xml:space="preserve">Software </w:t>
+      </w:r>
       <w:proofErr w:type="spellStart"/>
       <w:r>
-        <w:rPr>
-          <w:lang w:val="en-US"/>
-        </w:rPr>
-        <w:t>P</w:t>
-      </w:r>
-      <w:r>
-        <w:rPr>
-          <w:lang w:val="en-US"/>
-        </w:rPr>
-        <w:t>ó</w:t>
-      </w:r>
-      <w:r>
-        <w:rPr>
-          <w:lang w:val="en-US"/>
-        </w:rPr>
-        <w:t>s</w:t>
+        <w:t>Architecture</w:t>
       </w:r>
       <w:proofErr w:type="spellEnd"/>
-      <w:r>
-        <w:rPr>
-          <w:lang w:val="en-US"/>
-        </w:rPr>
-        <w:t xml:space="preserve"> Tech</w:t>
-      </w:r>
-      <w:r>
-        <w:rPr>
-          <w:lang w:val="en-US"/>
-        </w:rPr>
-        <w:t xml:space="preserve"> de </w:t>
-      </w:r>
-      <w:r>
-        <w:rPr>
-          <w:lang w:val="en-US"/>
-        </w:rPr>
-        <w:t>Software Architecture</w:t>
-      </w:r>
     </w:p>
     <w:p>
       <w:pPr>
@@ -106,7 +79,6 @@
         <w:rPr>
           <w:b/>
           <w:bCs/>
-          <w:lang w:val="en-US"/>
         </w:rPr>
       </w:pPr>
     </w:p>
@@ -117,7 +89,7 @@
           <w:rFonts w:ascii="Arial"/>
           <w:b/>
           <w:sz w:val="28"/>
-          <w:lang w:val="en-US"/>
+          <w:lang w:val="pt-BR"/>
         </w:rPr>
       </w:pPr>
     </w:p>
@@ -128,7 +100,6 @@
         <w:jc w:val="center"/>
         <w:rPr>
           <w:rFonts w:cs="Arial"/>
-          <w:lang w:val="en-US"/>
         </w:rPr>
       </w:pPr>
     </w:p>
@@ -426,6 +397,32 @@
           <w:sz w:val="28"/>
         </w:rPr>
       </w:pPr>
+    </w:p>
+    <w:p>
+      <w:pPr>
+        <w:ind w:firstLine="0"/>
+        <w:jc w:val="center"/>
+        <w:rPr>
+          <w:b/>
+          <w:bCs/>
+        </w:rPr>
+      </w:pPr>
+      <w:r>
+        <w:rPr>
+          <w:b/>
+          <w:bCs/>
+        </w:rPr>
+        <w:t xml:space="preserve">Grupo </w:t>
+      </w:r>
+      <w:proofErr w:type="spellStart"/>
+      <w:r>
+        <w:rPr>
+          <w:b/>
+          <w:bCs/>
+        </w:rPr>
+        <w:t>Archflow</w:t>
+      </w:r>
+      <w:proofErr w:type="spellEnd"/>
     </w:p>
     <w:p>
       <w:pPr>
@@ -445,15 +442,7 @@
           <w:bCs/>
           <w:lang w:val="en-US"/>
         </w:rPr>
-        <w:t>D</w:t>
-      </w:r>
-      <w:r>
-        <w:rPr>
-          <w:rFonts w:ascii="Arial"/>
-          <w:bCs/>
-          <w:lang w:val="en-US"/>
-        </w:rPr>
-        <w:t>igital e hands-on</w:t>
+        <w:t>Digital e hands-on</w:t>
       </w:r>
     </w:p>
     <w:p>
@@ -464,6 +453,20 @@
           <w:lang w:val="en-US"/>
         </w:rPr>
       </w:pPr>
+      <w:proofErr w:type="spellStart"/>
+      <w:r>
+        <w:rPr>
+          <w:lang w:val="en-US"/>
+        </w:rPr>
+        <w:t>Turma</w:t>
+      </w:r>
+      <w:proofErr w:type="spellEnd"/>
+      <w:r>
+        <w:rPr>
+          <w:lang w:val="en-US"/>
+        </w:rPr>
+        <w:t xml:space="preserve"> </w:t>
+      </w:r>
       <w:r>
         <w:rPr>
           <w:lang w:val="en-US"/>
@@ -594,36 +597,15 @@
       <w:pPr>
         <w:ind w:firstLine="0"/>
         <w:jc w:val="center"/>
-        <w:rPr>
-          <w:lang w:val="en-US"/>
-        </w:rPr>
-      </w:pPr>
+      </w:pPr>
+      <w:r>
+        <w:t xml:space="preserve">Pós Tech de Software </w:t>
+      </w:r>
       <w:proofErr w:type="spellStart"/>
       <w:r>
-        <w:rPr>
-          <w:lang w:val="en-US"/>
-        </w:rPr>
-        <w:t>P</w:t>
-      </w:r>
-      <w:r>
-        <w:rPr>
-          <w:lang w:val="en-US"/>
-        </w:rPr>
-        <w:t>ó</w:t>
-      </w:r>
-      <w:r>
-        <w:rPr>
-          <w:lang w:val="en-US"/>
-        </w:rPr>
-        <w:t>s</w:t>
+        <w:t>Architecture</w:t>
       </w:r>
       <w:proofErr w:type="spellEnd"/>
-      <w:r>
-        <w:rPr>
-          <w:lang w:val="en-US"/>
-        </w:rPr>
-        <w:t xml:space="preserve"> Tech de Software Architecture</w:t>
-      </w:r>
     </w:p>
     <w:p>
       <w:pPr>
@@ -632,14 +614,12 @@
         <w:rPr>
           <w:b/>
           <w:bCs/>
-          <w:lang w:val="en-US"/>
         </w:rPr>
       </w:pPr>
       <w:r>
         <w:rPr>
           <w:b/>
           <w:bCs/>
-          <w:lang w:val="en-US"/>
         </w:rPr>
         <w:t>FASE 1</w:t>
       </w:r>
@@ -685,13 +665,7 @@
         <w:rPr>
           <w:rFonts w:cs="Arial"/>
         </w:rPr>
-        <w:t xml:space="preserve"> - </w:t>
-      </w:r>
-      <w:r>
-        <w:rPr>
-          <w:rFonts w:cs="Arial"/>
-        </w:rPr>
-        <w:t>RM374903</w:t>
+        <w:t xml:space="preserve"> - RM374903</w:t>
       </w:r>
     </w:p>
     <w:p>
@@ -836,6 +810,7 @@
     <w:p>
       <w:pPr>
         <w:pStyle w:val="Corpodetexto"/>
+        <w:ind w:firstLine="0"/>
         <w:rPr>
           <w:rFonts w:ascii="Arial"/>
           <w:b/>
@@ -846,6 +821,7 @@
     <w:p>
       <w:pPr>
         <w:pStyle w:val="Corpodetexto"/>
+        <w:jc w:val="center"/>
         <w:rPr>
           <w:rFonts w:ascii="Arial"/>
           <w:b/>
@@ -855,79 +831,58 @@
     </w:p>
     <w:p>
       <w:pPr>
-        <w:pStyle w:val="Corpodetexto"/>
+        <w:ind w:firstLine="0"/>
         <w:jc w:val="center"/>
         <w:rPr>
-          <w:rFonts w:ascii="Arial"/>
           <w:b/>
-          <w:sz w:val="28"/>
-        </w:rPr>
-      </w:pPr>
+          <w:bCs/>
+        </w:rPr>
+      </w:pPr>
+      <w:r>
+        <w:rPr>
+          <w:b/>
+          <w:bCs/>
+        </w:rPr>
+        <w:t xml:space="preserve">Tech </w:t>
+      </w:r>
+      <w:proofErr w:type="spellStart"/>
+      <w:r>
+        <w:rPr>
+          <w:b/>
+          <w:bCs/>
+        </w:rPr>
+        <w:t>Challenge</w:t>
+      </w:r>
+      <w:proofErr w:type="spellEnd"/>
+      <w:r>
+        <w:rPr>
+          <w:b/>
+          <w:bCs/>
+        </w:rPr>
+        <w:t xml:space="preserve"> - V</w:t>
+      </w:r>
+      <w:r>
+        <w:rPr>
+          <w:b/>
+          <w:bCs/>
+        </w:rPr>
+        <w:t>isão geral do sistema</w:t>
+      </w:r>
     </w:p>
     <w:p>
       <w:pPr>
         <w:ind w:firstLine="0"/>
         <w:jc w:val="center"/>
-        <w:rPr>
-          <w:b/>
-          <w:bCs/>
-        </w:rPr>
-      </w:pPr>
-      <w:r>
-        <w:rPr>
-          <w:b/>
-          <w:bCs/>
-        </w:rPr>
-        <w:t xml:space="preserve">Tech </w:t>
-      </w:r>
-      <w:proofErr w:type="spellStart"/>
-      <w:r>
-        <w:rPr>
-          <w:b/>
-          <w:bCs/>
-        </w:rPr>
-        <w:t>Challenge</w:t>
-      </w:r>
-      <w:proofErr w:type="spellEnd"/>
-      <w:r>
-        <w:rPr>
-          <w:b/>
-          <w:bCs/>
-        </w:rPr>
-        <w:t xml:space="preserve"> - V</w:t>
-      </w:r>
-      <w:r>
-        <w:rPr>
-          <w:b/>
-          <w:bCs/>
-        </w:rPr>
-        <w:t>isão geral do sistema</w:t>
+      </w:pPr>
+      <w:r>
+        <w:t>Sistema de Gestão de Oficina Mecânica</w:t>
       </w:r>
     </w:p>
     <w:p>
       <w:pPr>
-        <w:ind w:firstLine="0"/>
-        <w:jc w:val="center"/>
-      </w:pPr>
-      <w:r>
-        <w:t>Sistema de Gestão de Oficina Mecânica</w:t>
-      </w:r>
-    </w:p>
-    <w:p>
-      <w:pPr>
-        <w:pStyle w:val="Corpodetexto"/>
-        <w:ind w:firstLine="0"/>
-        <w:rPr>
-          <w:rFonts w:ascii="Arial"/>
-          <w:b/>
-          <w:sz w:val="28"/>
-        </w:rPr>
-      </w:pPr>
-    </w:p>
-    <w:p>
-      <w:pPr>
         <w:pStyle w:val="Corpodetexto"/>
         <w:spacing w:before="8"/>
+        <w:ind w:firstLine="0"/>
         <w:rPr>
           <w:rFonts w:ascii="Arial"/>
           <w:b/>
@@ -1196,9 +1151,47 @@
     </w:p>
     <w:p>
       <w:pPr>
+        <w:pStyle w:val="Corpodetexto"/>
+        <w:ind w:firstLine="0"/>
+        <w:rPr>
+          <w:sz w:val="28"/>
+        </w:rPr>
+      </w:pPr>
+    </w:p>
+    <w:p>
+      <w:pPr>
         <w:ind w:firstLine="0"/>
         <w:jc w:val="center"/>
-      </w:pPr>
+        <w:rPr>
+          <w:b/>
+          <w:bCs/>
+        </w:rPr>
+      </w:pPr>
+      <w:r>
+        <w:rPr>
+          <w:b/>
+          <w:bCs/>
+        </w:rPr>
+        <w:t xml:space="preserve">Grupo </w:t>
+      </w:r>
+      <w:proofErr w:type="spellStart"/>
+      <w:r>
+        <w:rPr>
+          <w:b/>
+          <w:bCs/>
+        </w:rPr>
+        <w:t>Archflow</w:t>
+      </w:r>
+      <w:proofErr w:type="spellEnd"/>
+    </w:p>
+    <w:p>
+      <w:pPr>
+        <w:ind w:firstLine="0"/>
+        <w:jc w:val="center"/>
+      </w:pPr>
+      <w:r>
+        <w:t xml:space="preserve">Turma </w:t>
+      </w:r>
       <w:r>
         <w:t>Online</w:t>
       </w:r>
@@ -2649,6 +2642,11 @@
       </w:r>
     </w:p>
     <w:p>
+      <w:pPr>
+        <w:rPr>
+          <w:lang w:val="en-US"/>
+        </w:rPr>
+      </w:pPr>
       <w:r>
         <w:t xml:space="preserve">Este documento descreve a visão geral do sistema de gestão de oficina mecânica desenvolvido no Tech </w:t>
       </w:r>
@@ -2706,25 +2704,61 @@
       <w:r>
         <w:br/>
       </w:r>
+      <w:proofErr w:type="spellStart"/>
       <w:r>
         <w:rPr>
           <w:b/>
-        </w:rPr>
-        <w:t>Palavras-Chave:</w:t>
-      </w:r>
-      <w:r>
+          <w:lang w:val="en-US"/>
+        </w:rPr>
+        <w:t>Palavras-Chave</w:t>
+      </w:r>
+      <w:proofErr w:type="spellEnd"/>
+      <w:r>
+        <w:rPr>
+          <w:b/>
+          <w:lang w:val="en-US"/>
+        </w:rPr>
+        <w:t>:</w:t>
+      </w:r>
+      <w:r>
+        <w:rPr>
+          <w:lang w:val="en-US"/>
+        </w:rPr>
         <w:t xml:space="preserve"> </w:t>
       </w:r>
       <w:r>
-        <w:t xml:space="preserve">API REST; PHP 8.4; </w:t>
+        <w:rPr>
+          <w:lang w:val="en-US"/>
+        </w:rPr>
+        <w:t xml:space="preserve">API REST; PHP 8.4; Slim Framework; DDD; Docker; MySQL; JWT; </w:t>
       </w:r>
       <w:proofErr w:type="spellStart"/>
       <w:r>
-        <w:t>Slim</w:t>
+        <w:rPr>
+          <w:lang w:val="en-US"/>
+        </w:rPr>
+        <w:t>Oficina</w:t>
       </w:r>
       <w:proofErr w:type="spellEnd"/>
       <w:r>
-        <w:t xml:space="preserve"> Framework; DDD; Docker; MySQL; JWT; Oficina Mecânica.</w:t>
+        <w:rPr>
+          <w:lang w:val="en-US"/>
+        </w:rPr>
+        <w:t xml:space="preserve"> </w:t>
+      </w:r>
+      <w:proofErr w:type="spellStart"/>
+      <w:r>
+        <w:rPr>
+          <w:lang w:val="en-US"/>
+        </w:rPr>
+        <w:t>Mecânica</w:t>
+      </w:r>
+      <w:proofErr w:type="spellEnd"/>
+      <w:r>
+        <w:rPr>
+          <w:lang w:val="en-US"/>
+        </w:rPr>
+        <w:t>.</w:t>
       </w:r>
     </w:p>
     <w:p>
@@ -2735,6 +2769,7 @@
         <w:rPr>
           <w:sz w:val="23"/>
           <w:szCs w:val="23"/>
+          <w:lang w:val="en-US"/>
         </w:rPr>
       </w:pPr>
     </w:p>
@@ -2746,12 +2781,14 @@
         <w:rPr>
           <w:sz w:val="23"/>
           <w:szCs w:val="23"/>
+          <w:lang w:val="en-US"/>
         </w:rPr>
       </w:pPr>
       <w:r>
         <w:rPr>
           <w:sz w:val="23"/>
           <w:szCs w:val="23"/>
+          <w:lang w:val="en-US"/>
         </w:rPr>
         <w:br w:type="page"/>
       </w:r>
@@ -4207,7 +4244,7 @@
           <w:r>
             <w:fldChar w:fldCharType="separate"/>
           </w:r>
-          <w:hyperlink w:anchor="_Toc233457631" w:history="1">
+          <w:hyperlink w:anchor="_Toc233470842" w:history="1">
             <w:r>
               <w:rPr>
                 <w:rStyle w:val="Hyperlink"/>
@@ -4252,7 +4289,7 @@
                 <w:noProof/>
                 <w:webHidden/>
               </w:rPr>
-              <w:instrText xml:space="preserve"> PAGEREF _Toc233457631 \h </w:instrText>
+              <w:instrText xml:space="preserve"> PAGEREF _Toc233470842 \h </w:instrText>
             </w:r>
             <w:r>
               <w:rPr>
@@ -4295,7 +4332,7 @@
               <w14:ligatures w14:val="standardContextual"/>
             </w:rPr>
           </w:pPr>
-          <w:hyperlink w:anchor="_Toc233457632" w:history="1">
+          <w:hyperlink w:anchor="_Toc233470843" w:history="1">
             <w:r>
               <w:rPr>
                 <w:rStyle w:val="Hyperlink"/>
@@ -4355,7 +4392,7 @@
                 <w:noProof/>
                 <w:webHidden/>
               </w:rPr>
-              <w:instrText xml:space="preserve"> PAGEREF _Toc233457632 \h </w:instrText>
+              <w:instrText xml:space="preserve"> PAGEREF _Toc233470843 \h </w:instrText>
             </w:r>
             <w:r>
               <w:rPr>
@@ -4398,7 +4435,7 @@
               <w14:ligatures w14:val="standardContextual"/>
             </w:rPr>
           </w:pPr>
-          <w:hyperlink w:anchor="_Toc233457633" w:history="1">
+          <w:hyperlink w:anchor="_Toc233470844" w:history="1">
             <w:r>
               <w:rPr>
                 <w:rStyle w:val="Hyperlink"/>
@@ -4458,7 +4495,7 @@
                 <w:noProof/>
                 <w:webHidden/>
               </w:rPr>
-              <w:instrText xml:space="preserve"> PAGEREF _Toc233457633 \h </w:instrText>
+              <w:instrText xml:space="preserve"> PAGEREF _Toc233470844 \h </w:instrText>
             </w:r>
             <w:r>
               <w:rPr>
@@ -4501,7 +4538,7 @@
               <w14:ligatures w14:val="standardContextual"/>
             </w:rPr>
           </w:pPr>
-          <w:hyperlink w:anchor="_Toc233457634" w:history="1">
+          <w:hyperlink w:anchor="_Toc233470845" w:history="1">
             <w:r>
               <w:rPr>
                 <w:rStyle w:val="Hyperlink"/>
@@ -4546,7 +4583,7 @@
                 <w:noProof/>
                 <w:webHidden/>
               </w:rPr>
-              <w:instrText xml:space="preserve"> PAGEREF _Toc233457634 \h </w:instrText>
+              <w:instrText xml:space="preserve"> PAGEREF _Toc233470845 \h </w:instrText>
             </w:r>
             <w:r>
               <w:rPr>
@@ -4593,7 +4630,7 @@
               <w14:ligatures w14:val="standardContextual"/>
             </w:rPr>
           </w:pPr>
-          <w:hyperlink w:anchor="_Toc233457635" w:history="1">
+          <w:hyperlink w:anchor="_Toc233470846" w:history="1">
             <w:r>
               <w:rPr>
                 <w:rStyle w:val="Hyperlink"/>
@@ -4653,7 +4690,7 @@
                 <w:noProof/>
                 <w:webHidden/>
               </w:rPr>
-              <w:instrText xml:space="preserve"> PAGEREF _Toc233457635 \h </w:instrText>
+              <w:instrText xml:space="preserve"> PAGEREF _Toc233470846 \h </w:instrText>
             </w:r>
             <w:r>
               <w:rPr>
@@ -4700,7 +4737,7 @@
               <w14:ligatures w14:val="standardContextual"/>
             </w:rPr>
           </w:pPr>
-          <w:hyperlink w:anchor="_Toc233457636" w:history="1">
+          <w:hyperlink w:anchor="_Toc233470847" w:history="1">
             <w:r>
               <w:rPr>
                 <w:rStyle w:val="Hyperlink"/>
@@ -4745,7 +4782,7 @@
                 <w:noProof/>
                 <w:webHidden/>
               </w:rPr>
-              <w:instrText xml:space="preserve"> PAGEREF _Toc233457636 \h </w:instrText>
+              <w:instrText xml:space="preserve"> PAGEREF _Toc233470847 \h </w:instrText>
             </w:r>
             <w:r>
               <w:rPr>
@@ -4792,7 +4829,7 @@
               <w14:ligatures w14:val="standardContextual"/>
             </w:rPr>
           </w:pPr>
-          <w:hyperlink w:anchor="_Toc233457637" w:history="1">
+          <w:hyperlink w:anchor="_Toc233470848" w:history="1">
             <w:r>
               <w:rPr>
                 <w:rStyle w:val="Hyperlink"/>
@@ -4852,7 +4889,7 @@
                 <w:noProof/>
                 <w:webHidden/>
               </w:rPr>
-              <w:instrText xml:space="preserve"> PAGEREF _Toc233457637 \h </w:instrText>
+              <w:instrText xml:space="preserve"> PAGEREF _Toc233470848 \h </w:instrText>
             </w:r>
             <w:r>
               <w:rPr>
@@ -4899,7 +4936,7 @@
               <w14:ligatures w14:val="standardContextual"/>
             </w:rPr>
           </w:pPr>
-          <w:hyperlink w:anchor="_Toc233457638" w:history="1">
+          <w:hyperlink w:anchor="_Toc233470849" w:history="1">
             <w:r>
               <w:rPr>
                 <w:rStyle w:val="Hyperlink"/>
@@ -4944,7 +4981,7 @@
                 <w:noProof/>
                 <w:webHidden/>
               </w:rPr>
-              <w:instrText xml:space="preserve"> PAGEREF _Toc233457638 \h </w:instrText>
+              <w:instrText xml:space="preserve"> PAGEREF _Toc233470849 \h </w:instrText>
             </w:r>
             <w:r>
               <w:rPr>
@@ -4991,7 +5028,7 @@
               <w14:ligatures w14:val="standardContextual"/>
             </w:rPr>
           </w:pPr>
-          <w:hyperlink w:anchor="_Toc233457639" w:history="1">
+          <w:hyperlink w:anchor="_Toc233470850" w:history="1">
             <w:r>
               <w:rPr>
                 <w:rStyle w:val="Hyperlink"/>
@@ -5051,7 +5088,7 @@
                 <w:noProof/>
                 <w:webHidden/>
               </w:rPr>
-              <w:instrText xml:space="preserve"> PAGEREF _Toc233457639 \h </w:instrText>
+              <w:instrText xml:space="preserve"> PAGEREF _Toc233470850 \h </w:instrText>
             </w:r>
             <w:r>
               <w:rPr>
@@ -5094,7 +5131,7 @@
               <w14:ligatures w14:val="standardContextual"/>
             </w:rPr>
           </w:pPr>
-          <w:hyperlink w:anchor="_Toc233457640" w:history="1">
+          <w:hyperlink w:anchor="_Toc233470851" w:history="1">
             <w:r>
               <w:rPr>
                 <w:rStyle w:val="Hyperlink"/>
@@ -5154,7 +5191,7 @@
                 <w:noProof/>
                 <w:webHidden/>
               </w:rPr>
-              <w:instrText xml:space="preserve"> PAGEREF _Toc233457640 \h </w:instrText>
+              <w:instrText xml:space="preserve"> PAGEREF _Toc233470851 \h </w:instrText>
             </w:r>
             <w:r>
               <w:rPr>
@@ -5197,7 +5234,7 @@
               <w14:ligatures w14:val="standardContextual"/>
             </w:rPr>
           </w:pPr>
-          <w:hyperlink w:anchor="_Toc233457641" w:history="1">
+          <w:hyperlink w:anchor="_Toc233470852" w:history="1">
             <w:r>
               <w:rPr>
                 <w:rStyle w:val="Hyperlink"/>
@@ -5257,7 +5294,7 @@
                 <w:noProof/>
                 <w:webHidden/>
               </w:rPr>
-              <w:instrText xml:space="preserve"> PAGEREF _Toc233457641 \h </w:instrText>
+              <w:instrText xml:space="preserve"> PAGEREF _Toc233470852 \h </w:instrText>
             </w:r>
             <w:r>
               <w:rPr>
@@ -5300,7 +5337,7 @@
               <w14:ligatures w14:val="standardContextual"/>
             </w:rPr>
           </w:pPr>
-          <w:hyperlink w:anchor="_Toc233457642" w:history="1">
+          <w:hyperlink w:anchor="_Toc233470853" w:history="1">
             <w:r>
               <w:rPr>
                 <w:rStyle w:val="Hyperlink"/>
@@ -5360,7 +5397,7 @@
                 <w:noProof/>
                 <w:webHidden/>
               </w:rPr>
-              <w:instrText xml:space="preserve"> PAGEREF _Toc233457642 \h </w:instrText>
+              <w:instrText xml:space="preserve"> PAGEREF _Toc233470853 \h </w:instrText>
             </w:r>
             <w:r>
               <w:rPr>
@@ -5403,7 +5440,7 @@
               <w14:ligatures w14:val="standardContextual"/>
             </w:rPr>
           </w:pPr>
-          <w:hyperlink w:anchor="_Toc233457643" w:history="1">
+          <w:hyperlink w:anchor="_Toc233470854" w:history="1">
             <w:r>
               <w:rPr>
                 <w:rStyle w:val="Hyperlink"/>
@@ -5463,7 +5500,7 @@
                 <w:noProof/>
                 <w:webHidden/>
               </w:rPr>
-              <w:instrText xml:space="preserve"> PAGEREF _Toc233457643 \h </w:instrText>
+              <w:instrText xml:space="preserve"> PAGEREF _Toc233470854 \h </w:instrText>
             </w:r>
             <w:r>
               <w:rPr>
@@ -5506,7 +5543,7 @@
               <w14:ligatures w14:val="standardContextual"/>
             </w:rPr>
           </w:pPr>
-          <w:hyperlink w:anchor="_Toc233457644" w:history="1">
+          <w:hyperlink w:anchor="_Toc233470855" w:history="1">
             <w:r>
               <w:rPr>
                 <w:rStyle w:val="Hyperlink"/>
@@ -5566,7 +5603,7 @@
                 <w:noProof/>
                 <w:webHidden/>
               </w:rPr>
-              <w:instrText xml:space="preserve"> PAGEREF _Toc233457644 \h </w:instrText>
+              <w:instrText xml:space="preserve"> PAGEREF _Toc233470855 \h </w:instrText>
             </w:r>
             <w:r>
               <w:rPr>
@@ -5609,7 +5646,7 @@
               <w14:ligatures w14:val="standardContextual"/>
             </w:rPr>
           </w:pPr>
-          <w:hyperlink w:anchor="_Toc233457652" w:history="1">
+          <w:hyperlink w:anchor="_Toc233470863" w:history="1">
             <w:r>
               <w:rPr>
                 <w:rStyle w:val="Hyperlink"/>
@@ -5654,7 +5691,7 @@
                 <w:noProof/>
                 <w:webHidden/>
               </w:rPr>
-              <w:instrText xml:space="preserve"> PAGEREF _Toc233457652 \h </w:instrText>
+              <w:instrText xml:space="preserve"> PAGEREF _Toc233470863 \h </w:instrText>
             </w:r>
             <w:r>
               <w:rPr>
@@ -5960,7 +5997,7 @@
         </w:rPr>
         <w:fldChar w:fldCharType="separate"/>
       </w:r>
-      <w:hyperlink w:anchor="_Toc233457673" w:history="1">
+      <w:hyperlink w:anchor="_Toc233470864" w:history="1">
         <w:r>
           <w:rPr>
             <w:rStyle w:val="Hyperlink"/>
@@ -6002,7 +6039,7 @@
             <w:noProof/>
             <w:webHidden/>
           </w:rPr>
-          <w:instrText xml:space="preserve"> PAGEREF _Toc233457673 \h </w:instrText>
+          <w:instrText xml:space="preserve"> PAGEREF _Toc233470864 \h </w:instrText>
         </w:r>
         <w:r>
           <w:rPr>
@@ -6048,7 +6085,7 @@
           <w14:ligatures w14:val="standardContextual"/>
         </w:rPr>
       </w:pPr>
-      <w:hyperlink w:anchor="_Toc233457674" w:history="1">
+      <w:hyperlink w:anchor="_Toc233470865" w:history="1">
         <w:r>
           <w:rPr>
             <w:rStyle w:val="Hyperlink"/>
@@ -6090,7 +6127,7 @@
             <w:noProof/>
             <w:webHidden/>
           </w:rPr>
-          <w:instrText xml:space="preserve"> PAGEREF _Toc233457674 \h </w:instrText>
+          <w:instrText xml:space="preserve"> PAGEREF _Toc233470865 \h </w:instrText>
         </w:r>
         <w:r>
           <w:rPr>
@@ -6136,7 +6173,7 @@
           <w14:ligatures w14:val="standardContextual"/>
         </w:rPr>
       </w:pPr>
-      <w:hyperlink w:anchor="_Toc233457675" w:history="1">
+      <w:hyperlink w:anchor="_Toc233470866" w:history="1">
         <w:r>
           <w:rPr>
             <w:rStyle w:val="Hyperlink"/>
@@ -6178,7 +6215,7 @@
             <w:noProof/>
             <w:webHidden/>
           </w:rPr>
-          <w:instrText xml:space="preserve"> PAGEREF _Toc233457675 \h </w:instrText>
+          <w:instrText xml:space="preserve"> PAGEREF _Toc233470866 \h </w:instrText>
         </w:r>
         <w:r>
           <w:rPr>
@@ -6224,7 +6261,7 @@
           <w14:ligatures w14:val="standardContextual"/>
         </w:rPr>
       </w:pPr>
-      <w:hyperlink w:anchor="_Toc233457676" w:history="1">
+      <w:hyperlink w:anchor="_Toc233470867" w:history="1">
         <w:r>
           <w:rPr>
             <w:rStyle w:val="Hyperlink"/>
@@ -6266,7 +6303,7 @@
             <w:noProof/>
             <w:webHidden/>
           </w:rPr>
-          <w:instrText xml:space="preserve"> PAGEREF _Toc233457676 \h </w:instrText>
+          <w:instrText xml:space="preserve"> PAGEREF _Toc233470867 \h </w:instrText>
         </w:r>
         <w:r>
           <w:rPr>
@@ -6312,7 +6349,7 @@
           <w14:ligatures w14:val="standardContextual"/>
         </w:rPr>
       </w:pPr>
-      <w:hyperlink w:anchor="_Toc233457677" w:history="1">
+      <w:hyperlink w:anchor="_Toc233470868" w:history="1">
         <w:r>
           <w:rPr>
             <w:rStyle w:val="Hyperlink"/>
@@ -6354,7 +6391,7 @@
             <w:noProof/>
             <w:webHidden/>
           </w:rPr>
-          <w:instrText xml:space="preserve"> PAGEREF _Toc233457677 \h </w:instrText>
+          <w:instrText xml:space="preserve"> PAGEREF _Toc233470868 \h </w:instrText>
         </w:r>
         <w:r>
           <w:rPr>
@@ -6424,7 +6461,7 @@
           <w:numId w:val="68"/>
         </w:numPr>
       </w:pPr>
-      <w:bookmarkStart w:id="0" w:name="_Toc233457631"/>
+      <w:bookmarkStart w:id="0" w:name="_Toc233470842"/>
       <w:r>
         <w:lastRenderedPageBreak/>
         <w:t>Objetivo do Sistema</w:t>
@@ -6471,7 +6508,7 @@
           <w:numId w:val="68"/>
         </w:numPr>
       </w:pPr>
-      <w:bookmarkStart w:id="1" w:name="_Toc233457632"/>
+      <w:bookmarkStart w:id="1" w:name="_Toc233470843"/>
       <w:r>
         <w:lastRenderedPageBreak/>
         <w:t>Atores e Usuários</w:t>
@@ -6482,13 +6519,14 @@
       <w:pPr>
         <w:pStyle w:val="Legenda"/>
         <w:keepNext/>
+        <w:ind w:firstLine="0"/>
         <w:jc w:val="center"/>
         <w:rPr>
           <w:b/>
           <w:bCs/>
         </w:rPr>
       </w:pPr>
-      <w:bookmarkStart w:id="2" w:name="_Toc233457673"/>
+      <w:bookmarkStart w:id="2" w:name="_Toc233470864"/>
       <w:r>
         <w:rPr>
           <w:b/>
@@ -6966,7 +7004,7 @@
         </w:numPr>
       </w:pPr>
       <w:bookmarkStart w:id="3" w:name="_Toc134958396"/>
-      <w:bookmarkStart w:id="4" w:name="_Toc233457633"/>
+      <w:bookmarkStart w:id="4" w:name="_Toc233470844"/>
       <w:r>
         <w:lastRenderedPageBreak/>
         <w:t>Diagrama de Alto Nível (HLD)</w:t>
@@ -7153,7 +7191,7 @@
           <w:numId w:val="68"/>
         </w:numPr>
       </w:pPr>
-      <w:bookmarkStart w:id="6" w:name="_Toc233457634"/>
+      <w:bookmarkStart w:id="6" w:name="_Toc233470845"/>
       <w:r>
         <w:lastRenderedPageBreak/>
         <w:t>Principais Componentes</w:t>
@@ -7168,7 +7206,7 @@
           <w:numId w:val="68"/>
         </w:numPr>
       </w:pPr>
-      <w:bookmarkStart w:id="7" w:name="_Toc233457635"/>
+      <w:bookmarkStart w:id="7" w:name="_Toc233470846"/>
       <w:r>
         <w:t>Conteinerização Docker</w:t>
       </w:r>
@@ -7219,7 +7257,7 @@
           <w:numId w:val="68"/>
         </w:numPr>
       </w:pPr>
-      <w:bookmarkStart w:id="8" w:name="_Toc233457636"/>
+      <w:bookmarkStart w:id="8" w:name="_Toc233470847"/>
       <w:r>
         <w:t>Servidor Web Nginx</w:t>
       </w:r>
@@ -7262,7 +7300,7 @@
           <w:numId w:val="68"/>
         </w:numPr>
       </w:pPr>
-      <w:bookmarkStart w:id="9" w:name="_Toc233457637"/>
+      <w:bookmarkStart w:id="9" w:name="_Toc233470848"/>
       <w:r>
         <w:t>Aplicação PHP Slim Framework</w:t>
       </w:r>
@@ -7307,10 +7345,7 @@
       </w:r>
       <w:proofErr w:type="spellEnd"/>
       <w:r>
-        <w:t>:</w:t>
-      </w:r>
-      <w:r>
-        <w:t xml:space="preserve"> Resolve e despacha as requisições HTTP às funções corretas.</w:t>
+        <w:t>: Resolve e despacha as requisições HTTP às funções corretas.</w:t>
       </w:r>
     </w:p>
     <w:p>
@@ -7329,10 +7364,7 @@
         <w:t>Middlewares</w:t>
       </w:r>
       <w:r>
-        <w:t>:</w:t>
-      </w:r>
-      <w:r>
-        <w:t xml:space="preserve"> Interceptam requisições para tratar autenticação JWT e erros globais.</w:t>
+        <w:t>: Interceptam requisições para tratar autenticação JWT e erros globais.</w:t>
       </w:r>
     </w:p>
     <w:p>
@@ -7353,10 +7385,7 @@
       </w:r>
       <w:proofErr w:type="spellEnd"/>
       <w:r>
-        <w:t>:</w:t>
-      </w:r>
-      <w:r>
-        <w:t xml:space="preserve"> Recebem a requisição, extraem e validam dados de entrada e delegam ao Service.</w:t>
+        <w:t>: Recebem a requisição, extraem e validam dados de entrada e delegam ao Service.</w:t>
       </w:r>
     </w:p>
     <w:p>
@@ -7375,10 +7404,7 @@
         <w:t>Services</w:t>
       </w:r>
       <w:r>
-        <w:t>:</w:t>
-      </w:r>
-      <w:r>
-        <w:t xml:space="preserve"> Concentram as regras de negócio, orquestrando as operações de domínio.</w:t>
+        <w:t>: Concentram as regras de negócio, orquestrando as operações de domínio.</w:t>
       </w:r>
     </w:p>
     <w:p>
@@ -7399,10 +7425,7 @@
       </w:r>
       <w:proofErr w:type="spellEnd"/>
       <w:r>
-        <w:t>:</w:t>
-      </w:r>
-      <w:r>
-        <w:t xml:space="preserve"> Abstraem o acesso ao banco de dados, isolando a infraestrutura do domínio.</w:t>
+        <w:t>: Abstraem o acesso ao banco de dados, isolando a infraestrutura do domínio.</w:t>
       </w:r>
     </w:p>
     <w:p>
@@ -7413,7 +7436,7 @@
           <w:numId w:val="68"/>
         </w:numPr>
       </w:pPr>
-      <w:bookmarkStart w:id="10" w:name="_Toc233457638"/>
+      <w:bookmarkStart w:id="10" w:name="_Toc233470849"/>
       <w:r>
         <w:t>Banco de Dados MySQL 9</w:t>
       </w:r>
@@ -7460,7 +7483,7 @@
           <w:numId w:val="68"/>
         </w:numPr>
       </w:pPr>
-      <w:bookmarkStart w:id="11" w:name="_Toc233457639"/>
+      <w:bookmarkStart w:id="11" w:name="_Toc233470850"/>
       <w:r>
         <w:t>Serviços Externos</w:t>
       </w:r>
@@ -7470,13 +7493,14 @@
       <w:pPr>
         <w:pStyle w:val="Legenda"/>
         <w:keepNext/>
+        <w:ind w:firstLine="0"/>
         <w:jc w:val="center"/>
         <w:rPr>
           <w:b/>
           <w:bCs/>
         </w:rPr>
       </w:pPr>
-      <w:bookmarkStart w:id="12" w:name="_Toc233457674"/>
+      <w:bookmarkStart w:id="12" w:name="_Toc233470865"/>
       <w:r>
         <w:rPr>
           <w:b/>
@@ -7901,7 +7925,7 @@
         </w:numPr>
       </w:pPr>
       <w:bookmarkStart w:id="13" w:name="_Toc132116453"/>
-      <w:bookmarkStart w:id="14" w:name="_Toc233457640"/>
+      <w:bookmarkStart w:id="14" w:name="_Toc233470851"/>
       <w:r>
         <w:lastRenderedPageBreak/>
         <w:t>Módulos Funcionais</w:t>
@@ -7944,13 +7968,14 @@
       <w:pPr>
         <w:pStyle w:val="Legenda"/>
         <w:keepNext/>
+        <w:ind w:firstLine="0"/>
         <w:jc w:val="center"/>
         <w:rPr>
           <w:b/>
           <w:bCs/>
         </w:rPr>
       </w:pPr>
-      <w:bookmarkStart w:id="15" w:name="_Toc233457675"/>
+      <w:bookmarkStart w:id="15" w:name="_Toc233470866"/>
       <w:r>
         <w:rPr>
           <w:b/>
@@ -8782,7 +8807,7 @@
           <w:numId w:val="68"/>
         </w:numPr>
       </w:pPr>
-      <w:bookmarkStart w:id="16" w:name="_Toc233457641"/>
+      <w:bookmarkStart w:id="16" w:name="_Toc233470852"/>
       <w:r>
         <w:lastRenderedPageBreak/>
         <w:t>Segurança</w:t>
@@ -8939,7 +8964,7 @@
       <w:bookmarkStart w:id="24" w:name="_Toc153017668"/>
       <w:bookmarkStart w:id="25" w:name="_Toc153111289"/>
       <w:bookmarkStart w:id="26" w:name="_Hlk233448061"/>
-      <w:bookmarkStart w:id="27" w:name="_Toc233457642"/>
+      <w:bookmarkStart w:id="27" w:name="_Toc233470853"/>
       <w:bookmarkEnd w:id="17"/>
       <w:bookmarkEnd w:id="18"/>
       <w:bookmarkEnd w:id="19"/>
@@ -8959,13 +8984,14 @@
       <w:pPr>
         <w:pStyle w:val="Legenda"/>
         <w:keepNext/>
+        <w:ind w:firstLine="0"/>
         <w:jc w:val="center"/>
         <w:rPr>
           <w:b/>
           <w:bCs/>
         </w:rPr>
       </w:pPr>
-      <w:bookmarkStart w:id="28" w:name="_Toc233457676"/>
+      <w:bookmarkStart w:id="28" w:name="_Toc233470867"/>
       <w:r>
         <w:rPr>
           <w:b/>
@@ -9036,18 +9062,18 @@
     <w:tbl>
       <w:tblPr>
         <w:tblStyle w:val="Tabelacomgrade"/>
-        <w:tblW w:w="9026" w:type="dxa"/>
+        <w:tblW w:w="5000" w:type="pct"/>
         <w:tblLook w:val="0000" w:firstRow="0" w:lastRow="0" w:firstColumn="0" w:lastColumn="0" w:noHBand="0" w:noVBand="0"/>
       </w:tblPr>
       <w:tblGrid>
-        <w:gridCol w:w="2200"/>
-        <w:gridCol w:w="5200"/>
-        <w:gridCol w:w="1626"/>
+        <w:gridCol w:w="2071"/>
+        <w:gridCol w:w="4894"/>
+        <w:gridCol w:w="1529"/>
       </w:tblGrid>
       <w:tr>
         <w:tc>
           <w:tcPr>
-            <w:tcW w:w="2200" w:type="dxa"/>
+            <w:tcW w:w="1219" w:type="pct"/>
           </w:tcPr>
           <w:p>
             <w:pPr>
@@ -9090,7 +9116,7 @@
         </w:tc>
         <w:tc>
           <w:tcPr>
-            <w:tcW w:w="5200" w:type="dxa"/>
+            <w:tcW w:w="2881" w:type="pct"/>
           </w:tcPr>
           <w:p>
             <w:pPr>
@@ -9123,7 +9149,7 @@
         </w:tc>
         <w:tc>
           <w:tcPr>
-            <w:tcW w:w="1626" w:type="dxa"/>
+            <w:tcW w:w="901" w:type="pct"/>
           </w:tcPr>
           <w:p>
             <w:pPr>
@@ -9158,7 +9184,7 @@
       <w:tr>
         <w:tc>
           <w:tcPr>
-            <w:tcW w:w="2200" w:type="dxa"/>
+            <w:tcW w:w="1219" w:type="pct"/>
           </w:tcPr>
           <w:p>
             <w:pPr>
@@ -9187,7 +9213,7 @@
         </w:tc>
         <w:tc>
           <w:tcPr>
-            <w:tcW w:w="5200" w:type="dxa"/>
+            <w:tcW w:w="2881" w:type="pct"/>
           </w:tcPr>
           <w:p>
             <w:pPr>
@@ -9216,7 +9242,7 @@
         </w:tc>
         <w:tc>
           <w:tcPr>
-            <w:tcW w:w="1626" w:type="dxa"/>
+            <w:tcW w:w="901" w:type="pct"/>
           </w:tcPr>
           <w:p>
             <w:pPr>
@@ -9247,7 +9273,7 @@
       <w:tr>
         <w:tc>
           <w:tcPr>
-            <w:tcW w:w="2200" w:type="dxa"/>
+            <w:tcW w:w="1219" w:type="pct"/>
           </w:tcPr>
           <w:p>
             <w:pPr>
@@ -9276,7 +9302,7 @@
         </w:tc>
         <w:tc>
           <w:tcPr>
-            <w:tcW w:w="5200" w:type="dxa"/>
+            <w:tcW w:w="2881" w:type="pct"/>
           </w:tcPr>
           <w:p>
             <w:pPr>
@@ -9317,7 +9343,7 @@
         </w:tc>
         <w:tc>
           <w:tcPr>
-            <w:tcW w:w="1626" w:type="dxa"/>
+            <w:tcW w:w="901" w:type="pct"/>
           </w:tcPr>
           <w:p>
             <w:pPr>
@@ -9348,7 +9374,7 @@
       <w:tr>
         <w:tc>
           <w:tcPr>
-            <w:tcW w:w="2200" w:type="dxa"/>
+            <w:tcW w:w="1219" w:type="pct"/>
           </w:tcPr>
           <w:p>
             <w:pPr>
@@ -9377,7 +9403,7 @@
         </w:tc>
         <w:tc>
           <w:tcPr>
-            <w:tcW w:w="5200" w:type="dxa"/>
+            <w:tcW w:w="2881" w:type="pct"/>
           </w:tcPr>
           <w:p>
             <w:pPr>
@@ -9406,7 +9432,7 @@
         </w:tc>
         <w:tc>
           <w:tcPr>
-            <w:tcW w:w="1626" w:type="dxa"/>
+            <w:tcW w:w="901" w:type="pct"/>
           </w:tcPr>
           <w:p>
             <w:pPr>
@@ -9437,7 +9463,7 @@
       <w:tr>
         <w:tc>
           <w:tcPr>
-            <w:tcW w:w="2200" w:type="dxa"/>
+            <w:tcW w:w="1219" w:type="pct"/>
           </w:tcPr>
           <w:p>
             <w:pPr>
@@ -9466,7 +9492,7 @@
         </w:tc>
         <w:tc>
           <w:tcPr>
-            <w:tcW w:w="5200" w:type="dxa"/>
+            <w:tcW w:w="2881" w:type="pct"/>
           </w:tcPr>
           <w:p>
             <w:pPr>
@@ -9497,7 +9523,7 @@
         </w:tc>
         <w:tc>
           <w:tcPr>
-            <w:tcW w:w="1626" w:type="dxa"/>
+            <w:tcW w:w="901" w:type="pct"/>
           </w:tcPr>
           <w:p>
             <w:pPr>
@@ -9550,7 +9576,7 @@
       <w:tr>
         <w:tc>
           <w:tcPr>
-            <w:tcW w:w="2200" w:type="dxa"/>
+            <w:tcW w:w="1219" w:type="pct"/>
           </w:tcPr>
           <w:p>
             <w:pPr>
@@ -9581,7 +9607,7 @@
         </w:tc>
         <w:tc>
           <w:tcPr>
-            <w:tcW w:w="5200" w:type="dxa"/>
+            <w:tcW w:w="2881" w:type="pct"/>
           </w:tcPr>
           <w:p>
             <w:pPr>
@@ -9622,7 +9648,7 @@
         </w:tc>
         <w:tc>
           <w:tcPr>
-            <w:tcW w:w="1626" w:type="dxa"/>
+            <w:tcW w:w="901" w:type="pct"/>
           </w:tcPr>
           <w:p>
             <w:pPr>
@@ -9653,7 +9679,7 @@
       <w:tr>
         <w:tc>
           <w:tcPr>
-            <w:tcW w:w="2200" w:type="dxa"/>
+            <w:tcW w:w="1219" w:type="pct"/>
           </w:tcPr>
           <w:p>
             <w:pPr>
@@ -9682,7 +9708,7 @@
         </w:tc>
         <w:tc>
           <w:tcPr>
-            <w:tcW w:w="5200" w:type="dxa"/>
+            <w:tcW w:w="2881" w:type="pct"/>
           </w:tcPr>
           <w:p>
             <w:pPr>
@@ -9755,7 +9781,7 @@
         </w:tc>
         <w:tc>
           <w:tcPr>
-            <w:tcW w:w="1626" w:type="dxa"/>
+            <w:tcW w:w="901" w:type="pct"/>
           </w:tcPr>
           <w:p>
             <w:pPr>
@@ -9786,7 +9812,7 @@
       <w:tr>
         <w:tc>
           <w:tcPr>
-            <w:tcW w:w="2200" w:type="dxa"/>
+            <w:tcW w:w="1219" w:type="pct"/>
           </w:tcPr>
           <w:p>
             <w:pPr>
@@ -9815,7 +9841,7 @@
         </w:tc>
         <w:tc>
           <w:tcPr>
-            <w:tcW w:w="5200" w:type="dxa"/>
+            <w:tcW w:w="2881" w:type="pct"/>
           </w:tcPr>
           <w:p>
             <w:pPr>
@@ -9846,7 +9872,7 @@
         </w:tc>
         <w:tc>
           <w:tcPr>
-            <w:tcW w:w="1626" w:type="dxa"/>
+            <w:tcW w:w="901" w:type="pct"/>
           </w:tcPr>
           <w:p>
             <w:pPr>
@@ -9877,7 +9903,7 @@
       <w:tr>
         <w:tc>
           <w:tcPr>
-            <w:tcW w:w="2200" w:type="dxa"/>
+            <w:tcW w:w="1219" w:type="pct"/>
           </w:tcPr>
           <w:p>
             <w:pPr>
@@ -9906,7 +9932,7 @@
         </w:tc>
         <w:tc>
           <w:tcPr>
-            <w:tcW w:w="5200" w:type="dxa"/>
+            <w:tcW w:w="2881" w:type="pct"/>
           </w:tcPr>
           <w:p>
             <w:pPr>
@@ -9937,7 +9963,7 @@
         </w:tc>
         <w:tc>
           <w:tcPr>
-            <w:tcW w:w="1626" w:type="dxa"/>
+            <w:tcW w:w="901" w:type="pct"/>
           </w:tcPr>
           <w:p>
             <w:pPr>
@@ -9968,7 +9994,7 @@
       <w:tr>
         <w:tc>
           <w:tcPr>
-            <w:tcW w:w="2200" w:type="dxa"/>
+            <w:tcW w:w="1219" w:type="pct"/>
           </w:tcPr>
           <w:p>
             <w:pPr>
@@ -9998,7 +10024,7 @@
         </w:tc>
         <w:tc>
           <w:tcPr>
-            <w:tcW w:w="5200" w:type="dxa"/>
+            <w:tcW w:w="2881" w:type="pct"/>
           </w:tcPr>
           <w:p>
             <w:pPr>
@@ -10039,7 +10065,7 @@
         </w:tc>
         <w:tc>
           <w:tcPr>
-            <w:tcW w:w="1626" w:type="dxa"/>
+            <w:tcW w:w="901" w:type="pct"/>
           </w:tcPr>
           <w:p>
             <w:pPr>
@@ -10070,7 +10096,7 @@
       <w:tr>
         <w:tc>
           <w:tcPr>
-            <w:tcW w:w="2200" w:type="dxa"/>
+            <w:tcW w:w="1219" w:type="pct"/>
           </w:tcPr>
           <w:p>
             <w:pPr>
@@ -10099,7 +10125,7 @@
         </w:tc>
         <w:tc>
           <w:tcPr>
-            <w:tcW w:w="5200" w:type="dxa"/>
+            <w:tcW w:w="2881" w:type="pct"/>
           </w:tcPr>
           <w:p>
             <w:pPr>
@@ -10140,7 +10166,7 @@
         </w:tc>
         <w:tc>
           <w:tcPr>
-            <w:tcW w:w="1626" w:type="dxa"/>
+            <w:tcW w:w="901" w:type="pct"/>
           </w:tcPr>
           <w:p>
             <w:pPr>
@@ -10187,7 +10213,7 @@
           <w:numId w:val="68"/>
         </w:numPr>
       </w:pPr>
-      <w:bookmarkStart w:id="29" w:name="_Toc233457643"/>
+      <w:bookmarkStart w:id="29" w:name="_Toc233470854"/>
       <w:r>
         <w:lastRenderedPageBreak/>
         <w:t>Fluxo Macro de uma Requisição</w:t>
@@ -10206,13 +10232,14 @@
       <w:pPr>
         <w:pStyle w:val="Legenda"/>
         <w:keepNext/>
+        <w:ind w:firstLine="0"/>
         <w:jc w:val="center"/>
         <w:rPr>
           <w:b/>
           <w:bCs/>
         </w:rPr>
       </w:pPr>
-      <w:bookmarkStart w:id="30" w:name="_Toc233457677"/>
+      <w:bookmarkStart w:id="30" w:name="_Toc233470868"/>
       <w:r>
         <w:rPr>
           <w:b/>
@@ -10283,13 +10310,13 @@
     <w:tbl>
       <w:tblPr>
         <w:tblStyle w:val="Tabelacomgrade"/>
-        <w:tblW w:w="9287" w:type="dxa"/>
+        <w:tblW w:w="5000" w:type="pct"/>
         <w:tblLook w:val="0000" w:firstRow="0" w:lastRow="0" w:firstColumn="0" w:lastColumn="0" w:noHBand="0" w:noVBand="0"/>
       </w:tblPr>
       <w:tblGrid>
-        <w:gridCol w:w="854"/>
-        <w:gridCol w:w="2350"/>
-        <w:gridCol w:w="6083"/>
+        <w:gridCol w:w="781"/>
+        <w:gridCol w:w="2149"/>
+        <w:gridCol w:w="5564"/>
       </w:tblGrid>
       <w:tr>
         <w:trPr>
@@ -10297,7 +10324,7 @@
         </w:trPr>
         <w:tc>
           <w:tcPr>
-            <w:tcW w:w="854" w:type="dxa"/>
+            <w:tcW w:w="460" w:type="pct"/>
           </w:tcPr>
           <w:p>
             <w:pPr>
@@ -10330,7 +10357,7 @@
         </w:tc>
         <w:tc>
           <w:tcPr>
-            <w:tcW w:w="2350" w:type="dxa"/>
+            <w:tcW w:w="1265" w:type="pct"/>
           </w:tcPr>
           <w:p>
             <w:pPr>
@@ -10363,7 +10390,7 @@
         </w:tc>
         <w:tc>
           <w:tcPr>
-            <w:tcW w:w="6083" w:type="dxa"/>
+            <w:tcW w:w="3275" w:type="pct"/>
           </w:tcPr>
           <w:p>
             <w:pPr>
@@ -10401,7 +10428,7 @@
         </w:trPr>
         <w:tc>
           <w:tcPr>
-            <w:tcW w:w="854" w:type="dxa"/>
+            <w:tcW w:w="460" w:type="pct"/>
           </w:tcPr>
           <w:p>
             <w:pPr>
@@ -10430,7 +10457,7 @@
         </w:tc>
         <w:tc>
           <w:tcPr>
-            <w:tcW w:w="2350" w:type="dxa"/>
+            <w:tcW w:w="1265" w:type="pct"/>
           </w:tcPr>
           <w:p>
             <w:pPr>
@@ -10459,7 +10486,7 @@
         </w:tc>
         <w:tc>
           <w:tcPr>
-            <w:tcW w:w="6083" w:type="dxa"/>
+            <w:tcW w:w="3275" w:type="pct"/>
           </w:tcPr>
           <w:p>
             <w:pPr>
@@ -10493,7 +10520,7 @@
         </w:trPr>
         <w:tc>
           <w:tcPr>
-            <w:tcW w:w="854" w:type="dxa"/>
+            <w:tcW w:w="460" w:type="pct"/>
           </w:tcPr>
           <w:p>
             <w:pPr>
@@ -10522,7 +10549,7 @@
         </w:tc>
         <w:tc>
           <w:tcPr>
-            <w:tcW w:w="2350" w:type="dxa"/>
+            <w:tcW w:w="1265" w:type="pct"/>
           </w:tcPr>
           <w:p>
             <w:pPr>
@@ -10553,7 +10580,7 @@
         </w:tc>
         <w:tc>
           <w:tcPr>
-            <w:tcW w:w="6083" w:type="dxa"/>
+            <w:tcW w:w="3275" w:type="pct"/>
           </w:tcPr>
           <w:p>
             <w:pPr>
@@ -10599,7 +10626,7 @@
         </w:trPr>
         <w:tc>
           <w:tcPr>
-            <w:tcW w:w="854" w:type="dxa"/>
+            <w:tcW w:w="460" w:type="pct"/>
           </w:tcPr>
           <w:p>
             <w:pPr>
@@ -10628,7 +10655,7 @@
         </w:tc>
         <w:tc>
           <w:tcPr>
-            <w:tcW w:w="2350" w:type="dxa"/>
+            <w:tcW w:w="1265" w:type="pct"/>
           </w:tcPr>
           <w:p>
             <w:pPr>
@@ -10657,7 +10684,7 @@
         </w:tc>
         <w:tc>
           <w:tcPr>
-            <w:tcW w:w="6083" w:type="dxa"/>
+            <w:tcW w:w="3275" w:type="pct"/>
           </w:tcPr>
           <w:p>
             <w:pPr>
@@ -10711,7 +10738,7 @@
         </w:trPr>
         <w:tc>
           <w:tcPr>
-            <w:tcW w:w="854" w:type="dxa"/>
+            <w:tcW w:w="460" w:type="pct"/>
           </w:tcPr>
           <w:p>
             <w:pPr>
@@ -10740,7 +10767,7 @@
         </w:tc>
         <w:tc>
           <w:tcPr>
-            <w:tcW w:w="2350" w:type="dxa"/>
+            <w:tcW w:w="1265" w:type="pct"/>
           </w:tcPr>
           <w:p>
             <w:pPr>
@@ -10793,7 +10820,7 @@
         </w:tc>
         <w:tc>
           <w:tcPr>
-            <w:tcW w:w="6083" w:type="dxa"/>
+            <w:tcW w:w="3275" w:type="pct"/>
           </w:tcPr>
           <w:p>
             <w:pPr>
@@ -10867,7 +10894,7 @@
         </w:trPr>
         <w:tc>
           <w:tcPr>
-            <w:tcW w:w="854" w:type="dxa"/>
+            <w:tcW w:w="460" w:type="pct"/>
           </w:tcPr>
           <w:p>
             <w:pPr>
@@ -10896,7 +10923,7 @@
         </w:tc>
         <w:tc>
           <w:tcPr>
-            <w:tcW w:w="2350" w:type="dxa"/>
+            <w:tcW w:w="1265" w:type="pct"/>
           </w:tcPr>
           <w:p>
             <w:pPr>
@@ -10925,7 +10952,7 @@
         </w:tc>
         <w:tc>
           <w:tcPr>
-            <w:tcW w:w="6083" w:type="dxa"/>
+            <w:tcW w:w="3275" w:type="pct"/>
           </w:tcPr>
           <w:p>
             <w:pPr>
@@ -10959,7 +10986,7 @@
         </w:trPr>
         <w:tc>
           <w:tcPr>
-            <w:tcW w:w="854" w:type="dxa"/>
+            <w:tcW w:w="460" w:type="pct"/>
           </w:tcPr>
           <w:p>
             <w:pPr>
@@ -10988,7 +11015,7 @@
         </w:tc>
         <w:tc>
           <w:tcPr>
-            <w:tcW w:w="2350" w:type="dxa"/>
+            <w:tcW w:w="1265" w:type="pct"/>
           </w:tcPr>
           <w:p>
             <w:pPr>
@@ -11029,7 +11056,7 @@
         </w:tc>
         <w:tc>
           <w:tcPr>
-            <w:tcW w:w="6083" w:type="dxa"/>
+            <w:tcW w:w="3275" w:type="pct"/>
           </w:tcPr>
           <w:p>
             <w:pPr>
@@ -11063,7 +11090,7 @@
         </w:trPr>
         <w:tc>
           <w:tcPr>
-            <w:tcW w:w="854" w:type="dxa"/>
+            <w:tcW w:w="460" w:type="pct"/>
           </w:tcPr>
           <w:p>
             <w:pPr>
@@ -11092,7 +11119,7 @@
         </w:tc>
         <w:tc>
           <w:tcPr>
-            <w:tcW w:w="2350" w:type="dxa"/>
+            <w:tcW w:w="1265" w:type="pct"/>
           </w:tcPr>
           <w:p>
             <w:pPr>
@@ -11121,7 +11148,7 @@
         </w:tc>
         <w:tc>
           <w:tcPr>
-            <w:tcW w:w="6083" w:type="dxa"/>
+            <w:tcW w:w="3275" w:type="pct"/>
           </w:tcPr>
           <w:p>
             <w:pPr>
@@ -11155,7 +11182,7 @@
         </w:trPr>
         <w:tc>
           <w:tcPr>
-            <w:tcW w:w="854" w:type="dxa"/>
+            <w:tcW w:w="460" w:type="pct"/>
           </w:tcPr>
           <w:p>
             <w:pPr>
@@ -11185,7 +11212,7 @@
         </w:tc>
         <w:tc>
           <w:tcPr>
-            <w:tcW w:w="2350" w:type="dxa"/>
+            <w:tcW w:w="1265" w:type="pct"/>
           </w:tcPr>
           <w:p>
             <w:pPr>
@@ -11216,7 +11243,7 @@
         </w:tc>
         <w:tc>
           <w:tcPr>
-            <w:tcW w:w="6083" w:type="dxa"/>
+            <w:tcW w:w="3275" w:type="pct"/>
           </w:tcPr>
           <w:p>
             <w:pPr>
@@ -11263,7 +11290,7 @@
           <w:numId w:val="68"/>
         </w:numPr>
       </w:pPr>
-      <w:bookmarkStart w:id="31" w:name="_Toc233457644"/>
+      <w:bookmarkStart w:id="31" w:name="_Toc233470855"/>
       <w:r>
         <w:lastRenderedPageBreak/>
         <w:t>Conclusão</w:t>
@@ -11292,10 +11319,12 @@
       <w:bookmarkStart w:id="32" w:name="_Toc233449451"/>
       <w:bookmarkStart w:id="33" w:name="_Toc233449880"/>
       <w:bookmarkStart w:id="34" w:name="_Toc233457645"/>
+      <w:bookmarkStart w:id="35" w:name="_Toc233470856"/>
       <w:bookmarkEnd w:id="26"/>
       <w:bookmarkEnd w:id="32"/>
       <w:bookmarkEnd w:id="33"/>
       <w:bookmarkEnd w:id="34"/>
+      <w:bookmarkEnd w:id="35"/>
     </w:p>
     <w:p>
       <w:pPr>
@@ -11316,19 +11345,19 @@
           <w:sz w:val="28"/>
         </w:rPr>
       </w:pPr>
-      <w:bookmarkStart w:id="35" w:name="_Toc152965222"/>
-      <w:bookmarkStart w:id="36" w:name="_Toc152965358"/>
-      <w:bookmarkStart w:id="37" w:name="_Toc152965494"/>
-      <w:bookmarkStart w:id="38" w:name="_Toc152965634"/>
-      <w:bookmarkStart w:id="39" w:name="_Toc152965888"/>
-      <w:bookmarkStart w:id="40" w:name="_Toc152966103"/>
-      <w:bookmarkStart w:id="41" w:name="_Toc153017533"/>
-      <w:bookmarkStart w:id="42" w:name="_Toc153017669"/>
-      <w:bookmarkStart w:id="43" w:name="_Toc153111290"/>
-      <w:bookmarkStart w:id="44" w:name="_Toc233449452"/>
-      <w:bookmarkStart w:id="45" w:name="_Toc233449881"/>
-      <w:bookmarkStart w:id="46" w:name="_Toc233457646"/>
-      <w:bookmarkEnd w:id="35"/>
+      <w:bookmarkStart w:id="36" w:name="_Toc152965222"/>
+      <w:bookmarkStart w:id="37" w:name="_Toc152965358"/>
+      <w:bookmarkStart w:id="38" w:name="_Toc152965494"/>
+      <w:bookmarkStart w:id="39" w:name="_Toc152965634"/>
+      <w:bookmarkStart w:id="40" w:name="_Toc152965888"/>
+      <w:bookmarkStart w:id="41" w:name="_Toc152966103"/>
+      <w:bookmarkStart w:id="42" w:name="_Toc153017533"/>
+      <w:bookmarkStart w:id="43" w:name="_Toc153017669"/>
+      <w:bookmarkStart w:id="44" w:name="_Toc153111290"/>
+      <w:bookmarkStart w:id="45" w:name="_Toc233449452"/>
+      <w:bookmarkStart w:id="46" w:name="_Toc233449881"/>
+      <w:bookmarkStart w:id="47" w:name="_Toc233457646"/>
+      <w:bookmarkStart w:id="48" w:name="_Toc233470857"/>
       <w:bookmarkEnd w:id="36"/>
       <w:bookmarkEnd w:id="37"/>
       <w:bookmarkEnd w:id="38"/>
@@ -11340,6 +11369,8 @@
       <w:bookmarkEnd w:id="44"/>
       <w:bookmarkEnd w:id="45"/>
       <w:bookmarkEnd w:id="46"/>
+      <w:bookmarkEnd w:id="47"/>
+      <w:bookmarkEnd w:id="48"/>
     </w:p>
     <w:p>
       <w:pPr>
@@ -11360,20 +11391,19 @@
           <w:sz w:val="28"/>
         </w:rPr>
       </w:pPr>
-      <w:bookmarkStart w:id="47" w:name="_Toc152965223"/>
-      <w:bookmarkStart w:id="48" w:name="_Toc152965359"/>
-      <w:bookmarkStart w:id="49" w:name="_Toc152965495"/>
-      <w:bookmarkStart w:id="50" w:name="_Toc152965635"/>
-      <w:bookmarkStart w:id="51" w:name="_Toc152965889"/>
-      <w:bookmarkStart w:id="52" w:name="_Toc152966104"/>
-      <w:bookmarkStart w:id="53" w:name="_Toc153017534"/>
-      <w:bookmarkStart w:id="54" w:name="_Toc153017670"/>
-      <w:bookmarkStart w:id="55" w:name="_Toc153111291"/>
-      <w:bookmarkStart w:id="56" w:name="_Toc233449453"/>
-      <w:bookmarkStart w:id="57" w:name="_Toc233449882"/>
-      <w:bookmarkStart w:id="58" w:name="_Toc233457647"/>
-      <w:bookmarkEnd w:id="47"/>
-      <w:bookmarkEnd w:id="48"/>
+      <w:bookmarkStart w:id="49" w:name="_Toc152965223"/>
+      <w:bookmarkStart w:id="50" w:name="_Toc152965359"/>
+      <w:bookmarkStart w:id="51" w:name="_Toc152965495"/>
+      <w:bookmarkStart w:id="52" w:name="_Toc152965635"/>
+      <w:bookmarkStart w:id="53" w:name="_Toc152965889"/>
+      <w:bookmarkStart w:id="54" w:name="_Toc152966104"/>
+      <w:bookmarkStart w:id="55" w:name="_Toc153017534"/>
+      <w:bookmarkStart w:id="56" w:name="_Toc153017670"/>
+      <w:bookmarkStart w:id="57" w:name="_Toc153111291"/>
+      <w:bookmarkStart w:id="58" w:name="_Toc233449453"/>
+      <w:bookmarkStart w:id="59" w:name="_Toc233449882"/>
+      <w:bookmarkStart w:id="60" w:name="_Toc233457647"/>
+      <w:bookmarkStart w:id="61" w:name="_Toc233470858"/>
       <w:bookmarkEnd w:id="49"/>
       <w:bookmarkEnd w:id="50"/>
       <w:bookmarkEnd w:id="51"/>
@@ -11384,6 +11414,9 @@
       <w:bookmarkEnd w:id="56"/>
       <w:bookmarkEnd w:id="57"/>
       <w:bookmarkEnd w:id="58"/>
+      <w:bookmarkEnd w:id="59"/>
+      <w:bookmarkEnd w:id="60"/>
+      <w:bookmarkEnd w:id="61"/>
     </w:p>
     <w:p>
       <w:pPr>
@@ -11404,21 +11437,19 @@
           <w:sz w:val="28"/>
         </w:rPr>
       </w:pPr>
-      <w:bookmarkStart w:id="59" w:name="_Toc152965224"/>
-      <w:bookmarkStart w:id="60" w:name="_Toc152965360"/>
-      <w:bookmarkStart w:id="61" w:name="_Toc152965496"/>
-      <w:bookmarkStart w:id="62" w:name="_Toc152965636"/>
-      <w:bookmarkStart w:id="63" w:name="_Toc152965890"/>
-      <w:bookmarkStart w:id="64" w:name="_Toc152966105"/>
-      <w:bookmarkStart w:id="65" w:name="_Toc153017535"/>
-      <w:bookmarkStart w:id="66" w:name="_Toc153017671"/>
-      <w:bookmarkStart w:id="67" w:name="_Toc153111292"/>
-      <w:bookmarkStart w:id="68" w:name="_Toc233449454"/>
-      <w:bookmarkStart w:id="69" w:name="_Toc233449883"/>
-      <w:bookmarkStart w:id="70" w:name="_Toc233457648"/>
-      <w:bookmarkEnd w:id="59"/>
-      <w:bookmarkEnd w:id="60"/>
-      <w:bookmarkEnd w:id="61"/>
+      <w:bookmarkStart w:id="62" w:name="_Toc152965224"/>
+      <w:bookmarkStart w:id="63" w:name="_Toc152965360"/>
+      <w:bookmarkStart w:id="64" w:name="_Toc152965496"/>
+      <w:bookmarkStart w:id="65" w:name="_Toc152965636"/>
+      <w:bookmarkStart w:id="66" w:name="_Toc152965890"/>
+      <w:bookmarkStart w:id="67" w:name="_Toc152966105"/>
+      <w:bookmarkStart w:id="68" w:name="_Toc153017535"/>
+      <w:bookmarkStart w:id="69" w:name="_Toc153017671"/>
+      <w:bookmarkStart w:id="70" w:name="_Toc153111292"/>
+      <w:bookmarkStart w:id="71" w:name="_Toc233449454"/>
+      <w:bookmarkStart w:id="72" w:name="_Toc233449883"/>
+      <w:bookmarkStart w:id="73" w:name="_Toc233457648"/>
+      <w:bookmarkStart w:id="74" w:name="_Toc233470859"/>
       <w:bookmarkEnd w:id="62"/>
       <w:bookmarkEnd w:id="63"/>
       <w:bookmarkEnd w:id="64"/>
@@ -11428,6 +11459,10 @@
       <w:bookmarkEnd w:id="68"/>
       <w:bookmarkEnd w:id="69"/>
       <w:bookmarkEnd w:id="70"/>
+      <w:bookmarkEnd w:id="71"/>
+      <w:bookmarkEnd w:id="72"/>
+      <w:bookmarkEnd w:id="73"/>
+      <w:bookmarkEnd w:id="74"/>
     </w:p>
     <w:p>
       <w:pPr>
@@ -11448,22 +11483,19 @@
           <w:sz w:val="28"/>
         </w:rPr>
       </w:pPr>
-      <w:bookmarkStart w:id="71" w:name="_Toc152965225"/>
-      <w:bookmarkStart w:id="72" w:name="_Toc152965361"/>
-      <w:bookmarkStart w:id="73" w:name="_Toc152965497"/>
-      <w:bookmarkStart w:id="74" w:name="_Toc152965637"/>
-      <w:bookmarkStart w:id="75" w:name="_Toc152965891"/>
-      <w:bookmarkStart w:id="76" w:name="_Toc152966106"/>
-      <w:bookmarkStart w:id="77" w:name="_Toc153017536"/>
-      <w:bookmarkStart w:id="78" w:name="_Toc153017672"/>
-      <w:bookmarkStart w:id="79" w:name="_Toc153111293"/>
-      <w:bookmarkStart w:id="80" w:name="_Toc233449455"/>
-      <w:bookmarkStart w:id="81" w:name="_Toc233449884"/>
-      <w:bookmarkStart w:id="82" w:name="_Toc233457649"/>
-      <w:bookmarkEnd w:id="71"/>
-      <w:bookmarkEnd w:id="72"/>
-      <w:bookmarkEnd w:id="73"/>
-      <w:bookmarkEnd w:id="74"/>
+      <w:bookmarkStart w:id="75" w:name="_Toc152965225"/>
+      <w:bookmarkStart w:id="76" w:name="_Toc152965361"/>
+      <w:bookmarkStart w:id="77" w:name="_Toc152965497"/>
+      <w:bookmarkStart w:id="78" w:name="_Toc152965637"/>
+      <w:bookmarkStart w:id="79" w:name="_Toc152965891"/>
+      <w:bookmarkStart w:id="80" w:name="_Toc152966106"/>
+      <w:bookmarkStart w:id="81" w:name="_Toc153017536"/>
+      <w:bookmarkStart w:id="82" w:name="_Toc153017672"/>
+      <w:bookmarkStart w:id="83" w:name="_Toc153111293"/>
+      <w:bookmarkStart w:id="84" w:name="_Toc233449455"/>
+      <w:bookmarkStart w:id="85" w:name="_Toc233449884"/>
+      <w:bookmarkStart w:id="86" w:name="_Toc233457649"/>
+      <w:bookmarkStart w:id="87" w:name="_Toc233470860"/>
       <w:bookmarkEnd w:id="75"/>
       <w:bookmarkEnd w:id="76"/>
       <w:bookmarkEnd w:id="77"/>
@@ -11472,6 +11504,11 @@
       <w:bookmarkEnd w:id="80"/>
       <w:bookmarkEnd w:id="81"/>
       <w:bookmarkEnd w:id="82"/>
+      <w:bookmarkEnd w:id="83"/>
+      <w:bookmarkEnd w:id="84"/>
+      <w:bookmarkEnd w:id="85"/>
+      <w:bookmarkEnd w:id="86"/>
+      <w:bookmarkEnd w:id="87"/>
     </w:p>
     <w:p>
       <w:pPr>
@@ -11492,23 +11529,19 @@
           <w:sz w:val="28"/>
         </w:rPr>
       </w:pPr>
-      <w:bookmarkStart w:id="83" w:name="_Toc152965226"/>
-      <w:bookmarkStart w:id="84" w:name="_Toc152965362"/>
-      <w:bookmarkStart w:id="85" w:name="_Toc152965498"/>
-      <w:bookmarkStart w:id="86" w:name="_Toc152965638"/>
-      <w:bookmarkStart w:id="87" w:name="_Toc152965892"/>
-      <w:bookmarkStart w:id="88" w:name="_Toc152966107"/>
-      <w:bookmarkStart w:id="89" w:name="_Toc153017537"/>
-      <w:bookmarkStart w:id="90" w:name="_Toc153017673"/>
-      <w:bookmarkStart w:id="91" w:name="_Toc153111294"/>
-      <w:bookmarkStart w:id="92" w:name="_Toc233449456"/>
-      <w:bookmarkStart w:id="93" w:name="_Toc233449885"/>
-      <w:bookmarkStart w:id="94" w:name="_Toc233457650"/>
-      <w:bookmarkEnd w:id="83"/>
-      <w:bookmarkEnd w:id="84"/>
-      <w:bookmarkEnd w:id="85"/>
-      <w:bookmarkEnd w:id="86"/>
-      <w:bookmarkEnd w:id="87"/>
+      <w:bookmarkStart w:id="88" w:name="_Toc152965226"/>
+      <w:bookmarkStart w:id="89" w:name="_Toc152965362"/>
+      <w:bookmarkStart w:id="90" w:name="_Toc152965498"/>
+      <w:bookmarkStart w:id="91" w:name="_Toc152965638"/>
+      <w:bookmarkStart w:id="92" w:name="_Toc152965892"/>
+      <w:bookmarkStart w:id="93" w:name="_Toc152966107"/>
+      <w:bookmarkStart w:id="94" w:name="_Toc153017537"/>
+      <w:bookmarkStart w:id="95" w:name="_Toc153017673"/>
+      <w:bookmarkStart w:id="96" w:name="_Toc153111294"/>
+      <w:bookmarkStart w:id="97" w:name="_Toc233449456"/>
+      <w:bookmarkStart w:id="98" w:name="_Toc233449885"/>
+      <w:bookmarkStart w:id="99" w:name="_Toc233457650"/>
+      <w:bookmarkStart w:id="100" w:name="_Toc233470861"/>
       <w:bookmarkEnd w:id="88"/>
       <w:bookmarkEnd w:id="89"/>
       <w:bookmarkEnd w:id="90"/>
@@ -11516,6 +11549,12 @@
       <w:bookmarkEnd w:id="92"/>
       <w:bookmarkEnd w:id="93"/>
       <w:bookmarkEnd w:id="94"/>
+      <w:bookmarkEnd w:id="95"/>
+      <w:bookmarkEnd w:id="96"/>
+      <w:bookmarkEnd w:id="97"/>
+      <w:bookmarkEnd w:id="98"/>
+      <w:bookmarkEnd w:id="99"/>
+      <w:bookmarkEnd w:id="100"/>
     </w:p>
     <w:p>
       <w:pPr>
@@ -11536,30 +11575,32 @@
           <w:sz w:val="28"/>
         </w:rPr>
       </w:pPr>
-      <w:bookmarkStart w:id="95" w:name="_Toc152965227"/>
-      <w:bookmarkStart w:id="96" w:name="_Toc152965363"/>
-      <w:bookmarkStart w:id="97" w:name="_Toc152965499"/>
-      <w:bookmarkStart w:id="98" w:name="_Toc152965639"/>
-      <w:bookmarkStart w:id="99" w:name="_Toc152965893"/>
-      <w:bookmarkStart w:id="100" w:name="_Toc152966108"/>
-      <w:bookmarkStart w:id="101" w:name="_Toc153017538"/>
-      <w:bookmarkStart w:id="102" w:name="_Toc153017674"/>
-      <w:bookmarkStart w:id="103" w:name="_Toc153111295"/>
-      <w:bookmarkStart w:id="104" w:name="_Toc233449457"/>
-      <w:bookmarkStart w:id="105" w:name="_Toc233449886"/>
-      <w:bookmarkStart w:id="106" w:name="_Toc233457651"/>
-      <w:bookmarkEnd w:id="95"/>
-      <w:bookmarkEnd w:id="96"/>
-      <w:bookmarkEnd w:id="97"/>
-      <w:bookmarkEnd w:id="98"/>
-      <w:bookmarkEnd w:id="99"/>
-      <w:bookmarkEnd w:id="100"/>
+      <w:bookmarkStart w:id="101" w:name="_Toc152965227"/>
+      <w:bookmarkStart w:id="102" w:name="_Toc152965363"/>
+      <w:bookmarkStart w:id="103" w:name="_Toc152965499"/>
+      <w:bookmarkStart w:id="104" w:name="_Toc152965639"/>
+      <w:bookmarkStart w:id="105" w:name="_Toc152965893"/>
+      <w:bookmarkStart w:id="106" w:name="_Toc152966108"/>
+      <w:bookmarkStart w:id="107" w:name="_Toc153017538"/>
+      <w:bookmarkStart w:id="108" w:name="_Toc153017674"/>
+      <w:bookmarkStart w:id="109" w:name="_Toc153111295"/>
+      <w:bookmarkStart w:id="110" w:name="_Toc233449457"/>
+      <w:bookmarkStart w:id="111" w:name="_Toc233449886"/>
+      <w:bookmarkStart w:id="112" w:name="_Toc233457651"/>
+      <w:bookmarkStart w:id="113" w:name="_Toc233470862"/>
       <w:bookmarkEnd w:id="101"/>
       <w:bookmarkEnd w:id="102"/>
       <w:bookmarkEnd w:id="103"/>
       <w:bookmarkEnd w:id="104"/>
       <w:bookmarkEnd w:id="105"/>
       <w:bookmarkEnd w:id="106"/>
+      <w:bookmarkEnd w:id="107"/>
+      <w:bookmarkEnd w:id="108"/>
+      <w:bookmarkEnd w:id="109"/>
+      <w:bookmarkEnd w:id="110"/>
+      <w:bookmarkEnd w:id="111"/>
+      <w:bookmarkEnd w:id="112"/>
+      <w:bookmarkEnd w:id="113"/>
     </w:p>
     <w:p>
       <w:r>
@@ -11615,10 +11656,7 @@
       </w:r>
       <w:proofErr w:type="spellStart"/>
       <w:r>
-        <w:t>PosTec</w:t>
-      </w:r>
-      <w:r>
-        <w:t>h.</w:t>
+        <w:t>PosTech.</w:t>
       </w:r>
       <w:r>
         <w:t>Conclusã</w:t>
@@ -11633,7 +11671,7 @@
     </w:p>
     <w:p/>
     <w:p/>
-    <w:bookmarkStart w:id="107" w:name="_Toc233457652" w:displacedByCustomXml="next"/>
+    <w:bookmarkStart w:id="114" w:name="_Toc233470863" w:displacedByCustomXml="next"/>
     <w:sdt>
       <w:sdtPr>
         <w:rPr>
@@ -11660,7 +11698,7 @@
           <w:r>
             <w:t>Bibliografia</w:t>
           </w:r>
-          <w:bookmarkEnd w:id="107"/>
+          <w:bookmarkEnd w:id="114"/>
         </w:p>
         <w:sdt>
           <w:sdtPr>
@@ -20927,6 +20965,7 @@
   <w:style w:type="character" w:default="1" w:styleId="Fontepargpadro">
     <w:name w:val="Default Paragraph Font"/>
     <w:uiPriority w:val="1"/>
+    <w:semiHidden/>
     <w:unhideWhenUsed/>
   </w:style>
   <w:style w:type="table" w:default="1" w:styleId="Tabelanormal">

</xml_diff>